<commit_message>
docs: relatório Word da noite 06→07/08 em _NOVAS MELHORIAS
Co-Authored-By: Claude Fable 5 <noreply@anthropic.com>
</commit_message>
<xml_diff>
--- a/_NOVAS MELHORIAS/RELATORIO - O que foi feito na noite de 06-08.docx
+++ b/_NOVAS MELHORIAS/RELATORIO - O que foi feito na noite de 06-08.docx
@@ -40,7 +40,7 @@
           <w:i w:val="0"/>
           <w:sz w:val="24"/>
         </w:rPr>
-        <w:t>6 melhorias pedidas · 5 entregues · 1 aguardando dados seus</w:t>
+        <w:t>7 frentes · 6 entregues · só as revisões aguardam dados seus</w:t>
       </w:r>
     </w:p>
     <w:p>
@@ -58,7 +58,7 @@
           <w:i/>
           <w:color w:val="595959"/>
         </w:rPr>
-        <w:t>Este documento explica o que foi feito, as decisões tomadas e o que depende de você. Nada foi publicado em produção: está tudo commitado e testado localmente, aguardando seu OK para o deploy.</w:t>
+        <w:t>Este documento explica o que foi feito, as decisões tomadas e o que depende de você. Conforme você autorizou, TUDO JÁ FOI PUBLICADO EM PRODUÇÃO (push na main → deploy automático na Vercel).</w:t>
       </w:r>
     </w:p>
     <w:p>
@@ -397,7 +397,7 @@
           </w:tcPr>
           <w:p>
             <w:r>
-              <w:t>—</w:t>
+              <w:t>7</w:t>
             </w:r>
           </w:p>
         </w:tc>
@@ -407,7 +407,7 @@
           </w:tcPr>
           <w:p>
             <w:r>
-              <w:t>Extra: alinhamento YAMAHAWAY (Fórmula do Sucesso + banca)</w:t>
+              <w:t>Alinhar Smart Dealer ao YAMAHAWAY (Fórmula do Sucesso + banca)</w:t>
             </w:r>
           </w:p>
         </w:tc>
@@ -417,7 +417,7 @@
           </w:tcPr>
           <w:p>
             <w:r>
-              <w:t>📋 Analisado</w:t>
+              <w:t>✅ Entregue</w:t>
             </w:r>
           </w:p>
         </w:tc>
@@ -427,7 +427,7 @@
           </w:tcPr>
           <w:p>
             <w:r>
-              <w:t>Seção no fim deste documento</w:t>
+              <w:t>Nova tela “Dossiê da Banca” (menu Yamahaway)</w:t>
             </w:r>
           </w:p>
         </w:tc>
@@ -1865,7 +1865,7 @@
         <w:rPr>
           <w:color w:val="1F3864"/>
         </w:rPr>
-        <w:t>YAMAHAWAY — como estamos na Fórmula do Sucesso</w:t>
+        <w:t>Item 7 — Yamahaway: Dossiê da Banca (nova tela)</w:t>
       </w:r>
     </w:p>
     <w:p>
@@ -1874,7 +1874,18 @@
           <w:b w:val="0"/>
           <w:i w:val="0"/>
         </w:rPr>
-        <w:t>Li os 3 arquivos. Primeiro, a boa notícia dos gráficos de aranha da 1ª banca:</w:t>
+        <w:t>Li os 3 arquivos (Fórmula do Sucesso, gráficos de aranha e a transcrição da 1ª apresentação) e transformei em uma tela dentro do sistema — “Dossiê da Banca”, no menu Yamahaway (visível para titular e consultor). A ideia: em vez de slide estático, a resposta à banca é o próprio produto rodando.</w:t>
+      </w:r>
+    </w:p>
+    <w:p>
+      <w:pPr>
+        <w:pStyle w:val="Heading2"/>
+      </w:pPr>
+      <w:r>
+        <w:rPr>
+          <w:color w:val="1F3864"/>
+        </w:rPr>
+        <w:t>Como vocês estão nos números da 1ª banca</w:t>
       </w:r>
     </w:p>
     <w:tbl>
@@ -1912,7 +1923,7 @@
               <w:rPr>
                 <w:b/>
               </w:rPr>
-              <w:t>Grupo 6 (vocês)</w:t>
+              <w:t>Grupo 6</w:t>
             </w:r>
           </w:p>
         </w:tc>
@@ -2202,7 +2213,18 @@
           <w:b/>
           <w:i w:val="0"/>
         </w:rPr>
-        <w:t>Vocês estão NO NÍVEL DO TOP 3 em todos os critérios — acima da média Top 3 em Planejamento, Foco no Cliente e Inovação. O jogo agora é responder o que a banca cobrou:</w:t>
+        <w:t>Acima da média geral nos 6 critérios; acima da média do Top 3 em Planejamento, Foco no Cliente e Inovação. Os únicos gaps para o Top 3 são mínimos: Equipe (−0,11) e Pesquisa (−0,07). A própria banca disse: "vocês já subiram a expectativa de toda a banca".</w:t>
+      </w:r>
+    </w:p>
+    <w:p>
+      <w:pPr>
+        <w:pStyle w:val="Heading2"/>
+      </w:pPr>
+      <w:r>
+        <w:rPr>
+          <w:color w:val="1F3864"/>
+        </w:rPr>
+        <w:t>O que a tela entrega</w:t>
       </w:r>
     </w:p>
     <w:p>
@@ -2210,7 +2232,7 @@
         <w:pStyle w:val="ListBullet"/>
       </w:pPr>
       <w:r>
-        <w:t>KPIs do ponto de vista do CLIENTE (atendimento &lt;10min, conversão, jornada, transparência) e o comparativo com/sem Smart Dealer. → As telas novas ajudam no “com/sem”: PDCA, K2 e crédito são exatamente “o que muda na operação”.</w:t>
+        <w:t>Radar interativo Grupo 6 × média × Top 3 (os mesmos dados do pptm da banca).</w:t>
       </w:r>
     </w:p>
     <w:p>
@@ -2218,7 +2240,7 @@
         <w:pStyle w:val="ListBullet"/>
       </w:pPr>
       <w:r>
-        <w:t>Investimento (implantação + mensal) × ganhos. → A tela de Campanhas dá munição: só o trimestre Campeões de Vendas tem até R$ 100 mil em jogo — mais que o custo do sistema.</w:t>
+        <w:t>Cada cobrança da banca com a resposta e um link "Ver no sistema" para a evidência: integração da jornada (/crm), KPIs de cliente (/leads), investimento×ganho (/vouchers), know-how como vantagem (/performance), execução (/k2).</w:t>
       </w:r>
     </w:p>
     <w:p>
@@ -2226,7 +2248,23 @@
         <w:pStyle w:val="ListBullet"/>
       </w:pPr>
       <w:r>
-        <w:t>Vantagem competitiva pelo “como” (know-how/parametrização), não pelo software. → O argumento é o motor de PDCA e as regras de negócio Yamaha codificadas (dois relógios, decomposição mercado×share, circular de campanha) — isso nenhum concorrente copia baixando uma ferramenta.</w:t>
+        <w:t>Comparativo COM/SEM Smart Dealer em 7 processos (projeção, PDCA, mercado, K2, crédito, campanhas, atualização).</w:t>
+      </w:r>
+    </w:p>
+    <w:p>
+      <w:pPr>
+        <w:pStyle w:val="ListBullet"/>
+      </w:pPr>
+      <w:r>
+        <w:t>Business case: R$ 600/mês (piloto pago pela Nippon, dito na banca) contra os ganhos que o próprio sistema mede — só a campanha tem até R$ 100 mil no trimestre, ao vivo na tela.</w:t>
+      </w:r>
+    </w:p>
+    <w:p>
+      <w:pPr>
+        <w:pStyle w:val="ListBullet"/>
+      </w:pPr>
+      <w:r>
+        <w:t>Fórmula do Sucesso: evidência concreta por critério, no vocabulário da avaliação.</w:t>
       </w:r>
     </w:p>
     <w:p>
@@ -2237,18 +2275,10 @@
         <w:rPr>
           <w:b/>
         </w:rPr>
-        <w:t xml:space="preserve">Atenção: </w:t>
+        <w:t xml:space="preserve">Ponto sensível da banca: </w:t>
       </w:r>
       <w:r>
-        <w:t>IA Claude não homologada pela Yamaha (governança). → Ponto real. Sugestão: apresentar a IA como módulo opcional/desacoplável e levantar com a Yamaha o caminho de homologação. As telas novas desta noite NÃO dependem de IA — são dados e regras.</w:t>
-      </w:r>
-    </w:p>
-    <w:p>
-      <w:pPr>
-        <w:pStyle w:val="ListBullet"/>
-      </w:pPr>
-      <w:r>
-        <w:t>“Sair do conceitual → execução e mensuração”. → É exatamente o que os itens 1–6 entregam.</w:t>
+        <w:t xml:space="preserve">Governança da IA endereçada de frente: os módulos novos NÃO dependem de IA (dados + regras); a IA é camada opcional, e a transcrição registra a orientação do Júlio — "justifiquem o uso; isso aqui é mais do que justificativa". </w:t>
       </w:r>
     </w:p>
     <w:p>
@@ -2342,38 +2372,6 @@
           <w:p>
             <w:r>
               <w:t>leitura</w:t>
-            </w:r>
-          </w:p>
-        </w:tc>
-      </w:tr>
-      <w:tr>
-        <w:tc>
-          <w:tcPr>
-            <w:tcW w:type="dxa" w:w="2880"/>
-          </w:tcPr>
-          <w:p>
-            <w:r>
-              <w:t>2</w:t>
-            </w:r>
-          </w:p>
-        </w:tc>
-        <w:tc>
-          <w:tcPr>
-            <w:tcW w:type="dxa" w:w="2880"/>
-          </w:tcPr>
-          <w:p>
-            <w:r>
-              <w:t>Me dar OK para o deploy (eu faço o push → Vercel publica sozinho)</w:t>
-            </w:r>
-          </w:p>
-        </w:tc>
-        <w:tc>
-          <w:tcPr>
-            <w:tcW w:type="dxa" w:w="2880"/>
-          </w:tcPr>
-          <w:p>
-            <w:r>
-              <w:t>1 mensagem</w:t>
             </w:r>
           </w:p>
         </w:tc>
@@ -2523,7 +2521,7 @@
           <w:color w:val="595959"/>
           <w:sz w:val="18"/>
         </w:rPr>
-        <w:t>Técnico (para referência): 5 commits locais na main do smart-dealer, build de produção passando, 11 telas testadas com login real. Nada foi para produção ainda. Scripts mensais em smart-dealer/scripts/. A chave Anthropic que apareceu em chat antigo segue pendente de rotação.</w:t>
+        <w:t>Técnico (para referência): 6 commits na main do smart-dealer, build de produção passando, 12 telas testadas com login real, deploy feito via push na main (Vercel). Scripts mensais em smart-dealer/scripts/. A chave Anthropic que apareceu em chat antigo segue pendente de rotação.</w:t>
       </w:r>
     </w:p>
     <w:sectPr>

</xml_diff>

<commit_message>
docs: relatório atualizado com os ajustes da manhã de 07/08
Co-Authored-By: Claude Fable 5 <noreply@anthropic.com>
</commit_message>
<xml_diff>
--- a/_NOVAS MELHORIAS/RELATORIO - O que foi feito na noite de 06-08.docx
+++ b/_NOVAS MELHORIAS/RELATORIO - O que foi feito na noite de 06-08.docx
@@ -27,7 +27,7 @@
           <w:color w:val="595959"/>
           <w:sz w:val="26"/>
         </w:rPr>
-        <w:t>Relatório do trabalho — noite de 06 para 07/08/2026</w:t>
+        <w:t>Relatório do trabalho — noite de 06/08 + manhã de 07/08/2026</w:t>
       </w:r>
     </w:p>
     <w:p>
@@ -333,7 +333,7 @@
           </w:tcPr>
           <w:p>
             <w:r>
-              <w:t>⏸ Aguardando</w:t>
+              <w:t>⏸ Adiado</w:t>
             </w:r>
           </w:p>
         </w:tc>
@@ -343,7 +343,7 @@
           </w:tcPr>
           <w:p>
             <w:r>
-              <w:t>Prints meta × resultado não chegaram na pasta</w:t>
+              <w:t>Você está sem acesso ao pós-vendas — seguimos sem</w:t>
             </w:r>
           </w:p>
         </w:tc>
@@ -2289,6 +2289,175 @@
         <w:rPr>
           <w:color w:val="1F3864"/>
         </w:rPr>
+        <w:t>Ajustes da manhã de 07/08 (seus 3 pedidos)</w:t>
+      </w:r>
+    </w:p>
+    <w:p>
+      <w:pPr>
+        <w:pStyle w:val="Heading2"/>
+      </w:pPr>
+      <w:r>
+        <w:rPr>
+          <w:color w:val="1F3864"/>
+        </w:rPr>
+        <w:t>A) Fórmula do Sucesso virou diagnóstico + orientação (refeita)</w:t>
+      </w:r>
+    </w:p>
+    <w:p>
+      <w:r>
+        <w:rPr>
+          <w:b w:val="0"/>
+          <w:i w:val="0"/>
+        </w:rPr>
+        <w:t>Você pediu para NÃO justificar o trabalho em cima da fórmula, e sim identificar onde cada item já existe, o que falta e o que fazer. A tela "Dossiê da Banca" foi refeita:</w:t>
+      </w:r>
+    </w:p>
+    <w:p>
+      <w:pPr>
+        <w:pStyle w:val="ListBullet"/>
+      </w:pPr>
+      <w:r>
+        <w:t>Os 27 sub-itens do formulário de avaliação, um a um, com status: 10 TEMOS · 11 PARCIAIS · 6 FALTAM.</w:t>
+      </w:r>
+    </w:p>
+    <w:p>
+      <w:pPr>
+        <w:pStyle w:val="ListBullet"/>
+      </w:pPr>
+      <w:r>
+        <w:t>Cada item traz "Onde está" (a evidência no trabalho) e "O que fazer" (orientação concreta).</w:t>
+      </w:r>
+    </w:p>
+    <w:p>
+      <w:pPr>
+        <w:pStyle w:val="ListBullet"/>
+      </w:pPr>
+      <w:r>
+        <w:t>Bloco "As 5 ações que mais movem a nota": (1) pesquisa com 5–10 clientes reais da Nippon — é o único critério com dois itens zerados; (2) escrever 3 hipóteses testáveis + 3 metas-número com prazo; (3) mapear os 7 passos da venda e onde o sistema atua; (4) depoimento de 60s do titular em vídeo; (5) benchmark de 3–4 soluções concorrentes × Smart Dealer.</w:t>
+      </w:r>
+    </w:p>
+    <w:p>
+      <w:r>
+        <w:rPr>
+          <w:b/>
+          <w:i w:val="0"/>
+          <w:color w:val="9C0006"/>
+        </w:rPr>
+        <w:t>Os 6 itens que FALTAM (foco máximo): hipóteses claras; objetivo mensurável com prazo; posicionamento Yamaha declarado; fatores de compra tabulados; 7 passos descritos; pesquisas com clientes.</w:t>
+      </w:r>
+    </w:p>
+    <w:p>
+      <w:pPr>
+        <w:pStyle w:val="Heading2"/>
+      </w:pPr>
+      <w:r>
+        <w:rPr>
+          <w:color w:val="1F3864"/>
+        </w:rPr>
+        <w:t>B) Deck PowerPoint completo na tela Performance</w:t>
+      </w:r>
+    </w:p>
+    <w:p>
+      <w:r>
+        <w:rPr>
+          <w:b w:val="0"/>
+          <w:i w:val="0"/>
+        </w:rPr>
+        <w:t>Portei o gerador de .pptx inteiro do Performance Concessionário para dentro do Smart Dealer. Na tela Performance agora há DOIS botões: "Gerar PDCA (.xlsx)" e "Gerar Deck (.pptx)".</w:t>
+      </w:r>
+    </w:p>
+    <w:p>
+      <w:pPr>
+        <w:pStyle w:val="ListBullet"/>
+      </w:pPr>
+      <w:r>
+        <w:t>8 slides com os dados vivos: capa · o mês (carta/ritmo) · mercado (decomposição + gráfico mensal) · segmentos · praças + invasão · K2 · campanha Campeões de Vendas · PDCA paginado com a cara do Excel.</w:t>
+      </w:r>
+    </w:p>
+    <w:p>
+      <w:pPr>
+        <w:pStyle w:val="ListBullet"/>
+      </w:pPr>
+      <w:r>
+        <w:t>Com notas de apresentador em cada slide (o roteiro da call já vai embutido).</w:t>
+      </w:r>
+    </w:p>
+    <w:p>
+      <w:pPr>
+        <w:pStyle w:val="ListBullet"/>
+      </w:pPr>
+      <w:r>
+        <w:t>Mesmo visual do Deck_NOBRE-MOTOS que você gera no projeto original — testado e validado o arquivo.</w:t>
+      </w:r>
+    </w:p>
+    <w:p>
+      <w:pPr>
+        <w:pStyle w:val="Heading2"/>
+      </w:pPr>
+      <w:r>
+        <w:rPr>
+          <w:color w:val="1F3864"/>
+        </w:rPr>
+        <w:t>C) Atendimento de Leads no formato Motoryama (dados projetados)</w:t>
+      </w:r>
+    </w:p>
+    <w:p>
+      <w:r>
+        <w:rPr>
+          <w:b w:val="0"/>
+          <w:i w:val="0"/>
+        </w:rPr>
+        <w:t>Li os 5 PDFs e o print do WhatsApp que você deixou na pasta. Nova tela "Atendimento Diário" (menu Comercial) replica o formato por completo, com dados PROJETADOS da equipe Nippon (selo de simulação na tela — vira real quando as linhas forem conectadas):</w:t>
+      </w:r>
+    </w:p>
+    <w:p>
+      <w:pPr>
+        <w:pStyle w:val="ListBullet"/>
+      </w:pPr>
+      <w:r>
+        <w:t>Cobertura de linhas (4 de 6 ativas; alerta de linhas offline = lead perdido sem registro).</w:t>
+      </w:r>
+    </w:p>
+    <w:p>
+      <w:pPr>
+        <w:pStyle w:val="ListBullet"/>
+      </w:pPr>
+      <w:r>
+        <w:t>Resumo executivo por vendedor: leads recebidos, sem resposta (%), tempo médio, follow-up, tentou vender, qualificou — com veredicto verde/vermelho.</w:t>
+      </w:r>
+    </w:p>
+    <w:p>
+      <w:pPr>
+        <w:pStyle w:val="ListBullet"/>
+      </w:pPr>
+      <w:r>
+        <w:t>Placar da semana dia a dia · comparativo "ontem × seu dia normal" em barras.</w:t>
+      </w:r>
+    </w:p>
+    <w:p>
+      <w:pPr>
+        <w:pStyle w:val="ListBullet"/>
+      </w:pPr>
+      <w:r>
+        <w:t>Leads quentes — chamar HOJE: última mensagem do cliente, motivo da ligação e botão "Chamar agora" (WhatsApp).</w:t>
+      </w:r>
+    </w:p>
+    <w:p>
+      <w:pPr>
+        <w:pStyle w:val="ListBullet"/>
+      </w:pPr>
+      <w:r>
+        <w:t>Análise individual com tiles vs média do vendedor.</w:t>
+      </w:r>
+    </w:p>
+    <w:p>
+      <w:pPr>
+        <w:pStyle w:val="Heading1"/>
+      </w:pPr>
+      <w:r>
+        <w:rPr>
+          <w:color w:val="1F3864"/>
+        </w:rPr>
         <w:t>O que depende de você agora</w:t>
       </w:r>
     </w:p>
@@ -2393,7 +2562,7 @@
           </w:tcPr>
           <w:p>
             <w:r>
-              <w:t>Soltar na pasta _NOVAS MELHORIAS: prints das revisões + planilha da campanha</w:t>
+              <w:t>Soltar na pasta a circular Campeões de Vendas de AGOSTO (eu ajusto o /vouchers)</w:t>
             </w:r>
           </w:p>
         </w:tc>
@@ -2403,7 +2572,7 @@
           </w:tcPr>
           <w:p>
             <w:r>
-              <w:t>arrastar arquivos</w:t>
+              <w:t>arrastar arquivo</w:t>
             </w:r>
           </w:p>
         </w:tc>
@@ -2521,7 +2690,7 @@
           <w:color w:val="595959"/>
           <w:sz w:val="18"/>
         </w:rPr>
-        <w:t>Técnico (para referência): 6 commits na main do smart-dealer, build de produção passando, 12 telas testadas com login real, deploy feito via push na main (Vercel). Scripts mensais em smart-dealer/scripts/. A chave Anthropic que apareceu em chat antigo segue pendente de rotação.</w:t>
+        <w:t>Técnico (para referência): 9 commits na main do smart-dealer, build de produção passando, 13 telas testadas com login real, deploys feitos via push na main (Vercel) — o último na manhã de 07/08. Scripts mensais em smart-dealer/scripts/. A chave Anthropic que apareceu em chat antigo segue pendente de rotação.</w:t>
       </w:r>
     </w:p>
     <w:sectPr>

</xml_diff>

<commit_message>
docs: relatório com a separação das duas fontes de recebimento
Co-Authored-By: Claude Fable 5 <noreply@anthropic.com>
</commit_message>
<xml_diff>
--- a/_NOVAS MELHORIAS/RELATORIO - O que foi feito na noite de 06-08.docx
+++ b/_NOVAS MELHORIAS/RELATORIO - O que foi feito na noite de 06-08.docx
@@ -2452,6 +2452,461 @@
     </w:p>
     <w:p>
       <w:pPr>
+        <w:pStyle w:val="Heading2"/>
+      </w:pPr>
+      <w:r>
+        <w:rPr>
+          <w:color w:val="1F3864"/>
+        </w:rPr>
+        <w:t>D) Duas fontes de recebimento separadas na tela Campanhas Yamaha</w:t>
+      </w:r>
+    </w:p>
+    <w:p>
+      <w:r>
+        <w:rPr>
+          <w:b w:val="0"/>
+          <w:i w:val="0"/>
+        </w:rPr>
+        <w:t>Você apontou que o CCY recebe do Campeões de Vendas E das campanhas de voucher — eu tinha tratado como uma coisa só. Li as 5 circulares que você deixou na pasta e refiz a tela:</w:t>
+      </w:r>
+    </w:p>
+    <w:tbl>
+      <w:tblPr>
+        <w:tblStyle w:val="LightGrid-Accent1"/>
+        <w:tblW w:type="auto" w:w="0"/>
+        <w:tblLook w:firstColumn="1" w:firstRow="1" w:lastColumn="0" w:lastRow="0" w:noHBand="0" w:noVBand="1" w:val="04A0"/>
+      </w:tblPr>
+      <w:tblGrid>
+        <w:gridCol w:w="2160"/>
+        <w:gridCol w:w="2160"/>
+        <w:gridCol w:w="2160"/>
+        <w:gridCol w:w="2160"/>
+      </w:tblGrid>
+      <w:tr>
+        <w:tc>
+          <w:tcPr>
+            <w:tcW w:type="dxa" w:w="2160"/>
+          </w:tcPr>
+          <w:p>
+            <w:r>
+              <w:rPr>
+                <w:b/>
+              </w:rPr>
+              <w:t>Modelo</w:t>
+            </w:r>
+          </w:p>
+        </w:tc>
+        <w:tc>
+          <w:tcPr>
+            <w:tcW w:type="dxa" w:w="2160"/>
+          </w:tcPr>
+          <w:p>
+            <w:r>
+              <w:rPr>
+                <w:b/>
+              </w:rPr>
+              <w:t>Circular</w:t>
+            </w:r>
+          </w:p>
+        </w:tc>
+        <w:tc>
+          <w:tcPr>
+            <w:tcW w:type="dxa" w:w="2160"/>
+          </w:tcPr>
+          <w:p>
+            <w:r>
+              <w:rPr>
+                <w:b/>
+              </w:rPr>
+              <w:t>Bônus ao cliente</w:t>
+            </w:r>
+          </w:p>
+        </w:tc>
+        <w:tc>
+          <w:tcPr>
+            <w:tcW w:type="dxa" w:w="2160"/>
+          </w:tcPr>
+          <w:p>
+            <w:r>
+              <w:rPr>
+                <w:b/>
+              </w:rPr>
+              <w:t>Yamaha ressarce à CCY</w:t>
+            </w:r>
+          </w:p>
+        </w:tc>
+      </w:tr>
+      <w:tr>
+        <w:tc>
+          <w:tcPr>
+            <w:tcW w:type="dxa" w:w="2160"/>
+          </w:tcPr>
+          <w:p>
+            <w:r>
+              <w:t>Fazer FZ25 (250)</w:t>
+            </w:r>
+          </w:p>
+        </w:tc>
+        <w:tc>
+          <w:tcPr>
+            <w:tcW w:type="dxa" w:w="2160"/>
+          </w:tcPr>
+          <w:p>
+            <w:r>
+              <w:t>CA-MTC028-26</w:t>
+            </w:r>
+          </w:p>
+        </w:tc>
+        <w:tc>
+          <w:tcPr>
+            <w:tcW w:type="dxa" w:w="2160"/>
+          </w:tcPr>
+          <w:p>
+            <w:r>
+              <w:t>R$ 2.000</w:t>
+            </w:r>
+          </w:p>
+        </w:tc>
+        <w:tc>
+          <w:tcPr>
+            <w:tcW w:type="dxa" w:w="2160"/>
+          </w:tcPr>
+          <w:p>
+            <w:r>
+              <w:t>R$ 1.000/chassi</w:t>
+            </w:r>
+          </w:p>
+        </w:tc>
+      </w:tr>
+      <w:tr>
+        <w:tc>
+          <w:tcPr>
+            <w:tcW w:type="dxa" w:w="2160"/>
+          </w:tcPr>
+          <w:p>
+            <w:r>
+              <w:t>NMAX</w:t>
+            </w:r>
+          </w:p>
+        </w:tc>
+        <w:tc>
+          <w:tcPr>
+            <w:tcW w:type="dxa" w:w="2160"/>
+          </w:tcPr>
+          <w:p>
+            <w:r>
+              <w:t>CA-MTC029-26</w:t>
+            </w:r>
+          </w:p>
+        </w:tc>
+        <w:tc>
+          <w:tcPr>
+            <w:tcW w:type="dxa" w:w="2160"/>
+          </w:tcPr>
+          <w:p>
+            <w:r>
+              <w:t>R$ 1.000</w:t>
+            </w:r>
+          </w:p>
+        </w:tc>
+        <w:tc>
+          <w:tcPr>
+            <w:tcW w:type="dxa" w:w="2160"/>
+          </w:tcPr>
+          <w:p>
+            <w:r>
+              <w:t>R$ 500/chassi</w:t>
+            </w:r>
+          </w:p>
+        </w:tc>
+      </w:tr>
+      <w:tr>
+        <w:tc>
+          <w:tcPr>
+            <w:tcW w:type="dxa" w:w="2160"/>
+          </w:tcPr>
+          <w:p>
+            <w:r>
+              <w:t>MT-07</w:t>
+            </w:r>
+          </w:p>
+        </w:tc>
+        <w:tc>
+          <w:tcPr>
+            <w:tcW w:type="dxa" w:w="2160"/>
+          </w:tcPr>
+          <w:p>
+            <w:r>
+              <w:t>CA-MTC030-26</w:t>
+            </w:r>
+          </w:p>
+        </w:tc>
+        <w:tc>
+          <w:tcPr>
+            <w:tcW w:type="dxa" w:w="2160"/>
+          </w:tcPr>
+          <w:p>
+            <w:r>
+              <w:t>R$ 2.500</w:t>
+            </w:r>
+          </w:p>
+        </w:tc>
+        <w:tc>
+          <w:tcPr>
+            <w:tcW w:type="dxa" w:w="2160"/>
+          </w:tcPr>
+          <w:p>
+            <w:r>
+              <w:t>R$ 2.500/chassi (100% Yamaha)</w:t>
+            </w:r>
+          </w:p>
+        </w:tc>
+      </w:tr>
+      <w:tr>
+        <w:tc>
+          <w:tcPr>
+            <w:tcW w:type="dxa" w:w="2160"/>
+          </w:tcPr>
+          <w:p>
+            <w:r>
+              <w:t>Lander</w:t>
+            </w:r>
+          </w:p>
+        </w:tc>
+        <w:tc>
+          <w:tcPr>
+            <w:tcW w:type="dxa" w:w="2160"/>
+          </w:tcPr>
+          <w:p>
+            <w:r>
+              <w:t>CA-MTC031-26</w:t>
+            </w:r>
+          </w:p>
+        </w:tc>
+        <w:tc>
+          <w:tcPr>
+            <w:tcW w:type="dxa" w:w="2160"/>
+          </w:tcPr>
+          <w:p>
+            <w:r>
+              <w:t>R$ 2.000</w:t>
+            </w:r>
+          </w:p>
+        </w:tc>
+        <w:tc>
+          <w:tcPr>
+            <w:tcW w:type="dxa" w:w="2160"/>
+          </w:tcPr>
+          <w:p>
+            <w:r>
+              <w:t>R$ 1.000/chassi</w:t>
+            </w:r>
+          </w:p>
+        </w:tc>
+      </w:tr>
+      <w:tr>
+        <w:tc>
+          <w:tcPr>
+            <w:tcW w:type="dxa" w:w="2160"/>
+          </w:tcPr>
+          <w:p>
+            <w:r>
+              <w:t>XMAX 300</w:t>
+            </w:r>
+          </w:p>
+        </w:tc>
+        <w:tc>
+          <w:tcPr>
+            <w:tcW w:type="dxa" w:w="2160"/>
+          </w:tcPr>
+          <w:p>
+            <w:r>
+              <w:t>CA-MTC032-26</w:t>
+            </w:r>
+          </w:p>
+        </w:tc>
+        <w:tc>
+          <w:tcPr>
+            <w:tcW w:type="dxa" w:w="2160"/>
+          </w:tcPr>
+          <w:p>
+            <w:r>
+              <w:t>R$ 3.000 (voucher)</w:t>
+            </w:r>
+          </w:p>
+        </w:tc>
+        <w:tc>
+          <w:tcPr>
+            <w:tcW w:type="dxa" w:w="2160"/>
+          </w:tcPr>
+          <w:p>
+            <w:r>
+              <w:t>R$ 1.500/voucher</w:t>
+            </w:r>
+          </w:p>
+        </w:tc>
+      </w:tr>
+    </w:tbl>
+    <w:p>
+      <w:r>
+        <w:rPr>
+          <w:b w:val="0"/>
+          <w:i w:val="0"/>
+        </w:rPr>
+        <w:t>Cruzando com as vendas reais do banco (campanhas válidas também em julho, como você orientou):</w:t>
+      </w:r>
+    </w:p>
+    <w:tbl>
+      <w:tblPr>
+        <w:tblStyle w:val="LightGrid-Accent1"/>
+        <w:tblW w:type="auto" w:w="0"/>
+        <w:tblLook w:firstColumn="1" w:firstRow="1" w:lastColumn="0" w:lastRow="0" w:noHBand="0" w:noVBand="1" w:val="04A0"/>
+      </w:tblPr>
+      <w:tblGrid>
+        <w:gridCol w:w="4320"/>
+        <w:gridCol w:w="4320"/>
+      </w:tblGrid>
+      <w:tr>
+        <w:tc>
+          <w:tcPr>
+            <w:tcW w:type="dxa" w:w="4320"/>
+          </w:tcPr>
+          <w:p>
+            <w:r>
+              <w:rPr>
+                <w:b/>
+              </w:rPr>
+              <w:t>Recebível</w:t>
+            </w:r>
+          </w:p>
+        </w:tc>
+        <w:tc>
+          <w:tcPr>
+            <w:tcW w:type="dxa" w:w="4320"/>
+          </w:tcPr>
+          <w:p>
+            <w:r>
+              <w:rPr>
+                <w:b/>
+              </w:rPr>
+              <w:t>Valor</w:t>
+            </w:r>
+          </w:p>
+        </w:tc>
+      </w:tr>
+      <w:tr>
+        <w:tc>
+          <w:tcPr>
+            <w:tcW w:type="dxa" w:w="4320"/>
+          </w:tcPr>
+          <w:p>
+            <w:r>
+              <w:t>Vouchers — julho realizado (19 Fazer + 8 NMAX + 1 MT-07 + 21 Lander + 13 XMAX)</w:t>
+            </w:r>
+          </w:p>
+        </w:tc>
+        <w:tc>
+          <w:tcPr>
+            <w:tcW w:type="dxa" w:w="4320"/>
+          </w:tcPr>
+          <w:p>
+            <w:r>
+              <w:t>R$ 66.000</w:t>
+            </w:r>
+          </w:p>
+        </w:tc>
+      </w:tr>
+      <w:tr>
+        <w:tc>
+          <w:tcPr>
+            <w:tcW w:type="dxa" w:w="4320"/>
+          </w:tcPr>
+          <w:p>
+            <w:r>
+              <w:t>Campeões de Vendas — julho (90% da carta)</w:t>
+            </w:r>
+          </w:p>
+        </w:tc>
+        <w:tc>
+          <w:tcPr>
+            <w:tcW w:type="dxa" w:w="4320"/>
+          </w:tcPr>
+          <w:p>
+            <w:r>
+              <w:t>R$ 7.500</w:t>
+            </w:r>
+          </w:p>
+        </w:tc>
+      </w:tr>
+      <w:tr>
+        <w:tc>
+          <w:tcPr>
+            <w:tcW w:type="dxa" w:w="4320"/>
+          </w:tcPr>
+          <w:p>
+            <w:r>
+              <w:t>JÁ APURADO (as duas fontes)</w:t>
+            </w:r>
+          </w:p>
+        </w:tc>
+        <w:tc>
+          <w:tcPr>
+            <w:tcW w:type="dxa" w:w="4320"/>
+          </w:tcPr>
+          <w:p>
+            <w:r>
+              <w:t>R$ 73.500</w:t>
+            </w:r>
+          </w:p>
+        </w:tc>
+      </w:tr>
+      <w:tr>
+        <w:tc>
+          <w:tcPr>
+            <w:tcW w:type="dxa" w:w="4320"/>
+          </w:tcPr>
+          <w:p>
+            <w:r>
+              <w:t>Vouchers — projeção agosto (ritmo dos últimos 3 meses)</w:t>
+            </w:r>
+          </w:p>
+        </w:tc>
+        <w:tc>
+          <w:tcPr>
+            <w:tcW w:type="dxa" w:w="4320"/>
+          </w:tcPr>
+          <w:p>
+            <w:r>
+              <w:t>R$ 62.000</w:t>
+            </w:r>
+          </w:p>
+        </w:tc>
+      </w:tr>
+    </w:tbl>
+    <w:p>
+      <w:pPr>
+        <w:pStyle w:val="ListBullet"/>
+      </w:pPr>
+      <w:r>
+        <w:t>A tela agora mostra Fonte 1 (incentivo por modelo, tabela com real de julho e projeção de agosto) e Fonte 2 (Campeões de Vendas) com um consolidado no topo.</w:t>
+      </w:r>
+    </w:p>
+    <w:p>
+      <w:pPr>
+        <w:pStyle w:val="ListBullet"/>
+      </w:pPr>
+      <w:r>
+        <w:rPr>
+          <w:b/>
+        </w:rPr>
+        <w:t xml:space="preserve">Atenção: </w:t>
+      </w:r>
+      <w:r>
+        <w:t>Regras das circulares na tela: apuração por XML até 04/09, pagamento até 20/09, e o aviso de que o bônus NÃO acumula com taxas subsidiadas/voucher nacional — os valores são o teto do recebível.</w:t>
+      </w:r>
+    </w:p>
+    <w:p>
+      <w:pPr>
         <w:pStyle w:val="Heading1"/>
       </w:pPr>
       <w:r>
@@ -2690,7 +3145,7 @@
           <w:color w:val="595959"/>
           <w:sz w:val="18"/>
         </w:rPr>
-        <w:t>Técnico (para referência): 9 commits na main do smart-dealer, build de produção passando, 13 telas testadas com login real, deploys feitos via push na main (Vercel) — o último na manhã de 07/08. Scripts mensais em smart-dealer/scripts/. A chave Anthropic que apareceu em chat antigo segue pendente de rotação.</w:t>
+        <w:t>Técnico (para referência): 10 commits na main do smart-dealer, build de produção passando, 13 telas testadas com login real, deploys feitos via push na main (Vercel) — o último na manhã de 07/08. Scripts mensais em smart-dealer/scripts/. A chave Anthropic que apareceu em chat antigo segue pendente de rotação.</w:t>
       </w:r>
     </w:p>
     <w:sectPr>

</xml_diff>

<commit_message>
docs: relatório final com deck consolidado e minutas da banca
Co-Authored-By: Claude Fable 5 <noreply@anthropic.com>
</commit_message>
<xml_diff>
--- a/_NOVAS MELHORIAS/RELATORIO - O que foi feito na noite de 06-08.docx
+++ b/_NOVAS MELHORIAS/RELATORIO - O que foi feito na noite de 06-08.docx
@@ -2907,6 +2907,41 @@
     </w:p>
     <w:p>
       <w:pPr>
+        <w:pStyle w:val="Heading2"/>
+      </w:pPr>
+      <w:r>
+        <w:rPr>
+          <w:color w:val="1F3864"/>
+        </w:rPr>
+        <w:t>E) Deck consistente + minutas prontas para a 2ª banca</w:t>
+      </w:r>
+    </w:p>
+    <w:p>
+      <w:pPr>
+        <w:pStyle w:val="ListBullet"/>
+      </w:pPr>
+      <w:r>
+        <w:t>O slide de campanhas do deck PowerPoint agora consolida as DUAS fontes (Campeões + vouchers por modelo) — mesmos números da tela.</w:t>
+      </w:r>
+    </w:p>
+    <w:p>
+      <w:pPr>
+        <w:pStyle w:val="ListBullet"/>
+      </w:pPr>
+      <w:r>
+        <w:t>No Dossiê da Banca, deixei 4 MINUTAS PRONTAS para os itens em branco do formulário — é validar e levar pro slide: (1) objetivo em uma frase + 3 metas-número com prazo; (2) as 3 hipóteses testáveis no formato "se X, então Y — medido por Z"; (3) os 7 passos da venda com onde o Smart Dealer atua em cada um; (4) minuta de posicionamento ("a Honda vende mais; a Yamaha pode atender melhor").</w:t>
+      </w:r>
+    </w:p>
+    <w:p>
+      <w:pPr>
+        <w:pStyle w:val="ListBullet"/>
+      </w:pPr>
+      <w:r>
+        <w:t>Continuam dependendo de campo (ações nº 1 da lista de prioridades): pesquisa com 5–10 clientes reais e tabulação dos fatores de compra das conversas.</w:t>
+      </w:r>
+    </w:p>
+    <w:p>
+      <w:pPr>
         <w:pStyle w:val="Heading1"/>
       </w:pPr>
       <w:r>
@@ -3145,7 +3180,7 @@
           <w:color w:val="595959"/>
           <w:sz w:val="18"/>
         </w:rPr>
-        <w:t>Técnico (para referência): 10 commits na main do smart-dealer, build de produção passando, 13 telas testadas com login real, deploys feitos via push na main (Vercel) — o último na manhã de 07/08. Scripts mensais em smart-dealer/scripts/. A chave Anthropic que apareceu em chat antigo segue pendente de rotação.</w:t>
+        <w:t>Técnico (para referência): 12 commits na main do smart-dealer, build de produção passando, 13 telas testadas com login real, deploys feitos via push na main (Vercel) — o último na manhã de 07/08. Scripts mensais em smart-dealer/scripts/. A chave Anthropic que apareceu em chat antigo segue pendente de rotação.</w:t>
       </w:r>
     </w:p>
     <w:sectPr>

</xml_diff>